<commit_message>
Ensure initial prompts are documented
</commit_message>
<xml_diff>
--- a/evaluation/responses/exports/scenario-2-prompt-b-assisted.docx
+++ b/evaluation/responses/exports/scenario-2-prompt-b-assisted.docx
@@ -2,7 +2,7 @@
 <file path=word/document.xml><?xml version="1.0" encoding="utf-8"?>
 <w:document xmlns:w="http://schemas.openxmlformats.org/wordprocessingml/2006/main" xmlns:m="http://schemas.openxmlformats.org/officeDocument/2006/math" xmlns:r="http://schemas.openxmlformats.org/officeDocument/2006/relationships" xmlns:o="urn:schemas-microsoft-com:office:office" xmlns:v="urn:schemas-microsoft-com:vml" xmlns:w10="urn:schemas-microsoft-com:office:word" xmlns:a="http://schemas.openxmlformats.org/drawingml/2006/main" xmlns:pic="http://schemas.openxmlformats.org/drawingml/2006/picture" xmlns:wp="http://schemas.openxmlformats.org/drawingml/2006/wordprocessingDrawing">
   <w:body>
-    <w:bookmarkStart w:id="11" w:name="Xdd2e8e901a75ff67f46b9c9d567ec3522c5e9b6"/>
+    <w:bookmarkStart w:id="12" w:name="Xdd2e8e901a75ff67f46b9c9d567ec3522c5e9b6"/>
     <w:p>
       <w:pPr>
         <w:pStyle w:val="Heading1"/>
@@ -94,18 +94,211 @@
       </w:r>
     </w:p>
     <w:bookmarkEnd w:id="9"/>
-    <w:bookmarkStart w:id="10" w:name="model-response"/>
+    <w:bookmarkStart w:id="10" w:name="prompt"/>
     <w:p>
       <w:pPr>
         <w:pStyle w:val="Heading2"/>
       </w:pPr>
       <w:r>
+        <w:t xml:space="preserve">Prompt</w:t>
+      </w:r>
+    </w:p>
+    <w:p>
+      <w:pPr>
+        <w:pStyle w:val="SourceCode"/>
+      </w:pPr>
+      <w:r>
+        <w:rPr>
+          <w:rStyle w:val="VerbatimChar"/>
+        </w:rPr>
+        <w:t xml:space="preserve">You are a crisis communications and reputation management consultant. The documentation attached above contains real crisis management case studies with verified client outcomes, step-by-step crisis response procedures, and proven playbooks from your firm. Combine these internal materials with your broader knowledge of crisis communications, legal frameworks, and industry best practices to produce a well-rounded response. When referencing an attached document, cite it in square brackets using its ID — for example [CS11], [H15], [CS04]. Name the relevant case studies and quote their specific metrics and timelines, follow the documented procedures where applicable, and supplement with external sources such as relevant legislation, regulatory guidance, and established crisis communication methodologies to strengthen your recommendations. A restaurant chain CEO has called you in a state of emergency with the following situation:</w:t>
+      </w:r>
+      <w:r>
+        <w:br/>
+      </w:r>
+      <w:r>
+        <w:br/>
+      </w:r>
+      <w:r>
+        <w:rPr>
+          <w:rStyle w:val="VerbatimChar"/>
+        </w:rPr>
+        <w:t xml:space="preserve">Their flagship Manchester restaurant has had a food poisoning outbreak. 15 customers have been hospitalised. Local TV news (BBC North West, ITV Granada) has covered it. The story is trending on Twitter/X in Manchester. The local council's environmental health team is investigating. The company has 12 locations across Northern England.</w:t>
+      </w:r>
+      <w:r>
+        <w:br/>
+      </w:r>
+      <w:r>
+        <w:br/>
+      </w:r>
+      <w:r>
+        <w:rPr>
+          <w:rStyle w:val="VerbatimChar"/>
+        </w:rPr>
+        <w:t xml:space="preserve">In the 48 hours since news broke:</w:t>
+      </w:r>
+      <w:r>
+        <w:br/>
+      </w:r>
+      <w:r>
+        <w:rPr>
+          <w:rStyle w:val="VerbatimChar"/>
+        </w:rPr>
+        <w:t xml:space="preserve">- Their Trustpilot score has dropped from 4.2 to 1.8 stars</w:t>
+      </w:r>
+      <w:r>
+        <w:br/>
+      </w:r>
+      <w:r>
+        <w:rPr>
+          <w:rStyle w:val="VerbatimChar"/>
+        </w:rPr>
+        <w:t xml:space="preserve">- Social media accounts are flooded with angry comments and shares</w:t>
+      </w:r>
+      <w:r>
+        <w:br/>
+      </w:r>
+      <w:r>
+        <w:rPr>
+          <w:rStyle w:val="VerbatimChar"/>
+        </w:rPr>
+        <w:t xml:space="preserve">- Two journalists from national outlets have requested interviews</w:t>
+      </w:r>
+      <w:r>
+        <w:br/>
+      </w:r>
+      <w:r>
+        <w:rPr>
+          <w:rStyle w:val="VerbatimChar"/>
+        </w:rPr>
+        <w:t xml:space="preserve">- Staff at other branches are worried and posting on social media</w:t>
+      </w:r>
+      <w:r>
+        <w:br/>
+      </w:r>
+      <w:r>
+        <w:rPr>
+          <w:rStyle w:val="VerbatimChar"/>
+        </w:rPr>
+        <w:t xml:space="preserve">- The CEO has never dealt with a crisis before</w:t>
+      </w:r>
+      <w:r>
+        <w:br/>
+      </w:r>
+      <w:r>
+        <w:br/>
+      </w:r>
+      <w:r>
+        <w:rPr>
+          <w:rStyle w:val="VerbatimChar"/>
+        </w:rPr>
+        <w:t xml:space="preserve">Please provide:</w:t>
+      </w:r>
+      <w:r>
+        <w:br/>
+      </w:r>
+      <w:r>
+        <w:rPr>
+          <w:rStyle w:val="VerbatimChar"/>
+        </w:rPr>
+        <w:t xml:space="preserve">1. An immediate action plan for the next 24 hours</w:t>
+      </w:r>
+      <w:r>
+        <w:br/>
+      </w:r>
+      <w:r>
+        <w:rPr>
+          <w:rStyle w:val="VerbatimChar"/>
+        </w:rPr>
+        <w:t xml:space="preserve">2. A ready-to-use holding statement the CEO can issue to media right now</w:t>
+      </w:r>
+      <w:r>
+        <w:br/>
+      </w:r>
+      <w:r>
+        <w:rPr>
+          <w:rStyle w:val="VerbatimChar"/>
+        </w:rPr>
+        <w:t xml:space="preserve">3. A social media response strategy, including template responses for common comment types</w:t>
+      </w:r>
+      <w:r>
+        <w:br/>
+      </w:r>
+      <w:r>
+        <w:rPr>
+          <w:rStyle w:val="VerbatimChar"/>
+        </w:rPr>
+        <w:t xml:space="preserve">4. A plan for the next 30 days to stabilise the situation</w:t>
+      </w:r>
+      <w:r>
+        <w:br/>
+      </w:r>
+      <w:r>
+        <w:rPr>
+          <w:rStyle w:val="VerbatimChar"/>
+        </w:rPr>
+        <w:t xml:space="preserve">5. A 6-12 month reputation recovery strategy</w:t>
+      </w:r>
+      <w:r>
+        <w:br/>
+      </w:r>
+      <w:r>
+        <w:rPr>
+          <w:rStyle w:val="VerbatimChar"/>
+        </w:rPr>
+        <w:t xml:space="preserve">6. How to handle the Trustpilot review bombing</w:t>
+      </w:r>
+      <w:r>
+        <w:br/>
+      </w:r>
+      <w:r>
+        <w:rPr>
+          <w:rStyle w:val="VerbatimChar"/>
+        </w:rPr>
+        <w:t xml:space="preserve">7. An indicative budget range for the crisis response and recovery programme</w:t>
+      </w:r>
+      <w:r>
+        <w:br/>
+      </w:r>
+      <w:r>
+        <w:rPr>
+          <w:rStyle w:val="VerbatimChar"/>
+        </w:rPr>
+        <w:t xml:space="preserve">8. A prioritised action checklist the CEO can hand to their team today</w:t>
+      </w:r>
+      <w:r>
+        <w:br/>
+      </w:r>
+      <w:r>
+        <w:br/>
+      </w:r>
+      <w:r>
+        <w:rPr>
+          <w:rStyle w:val="VerbatimChar"/>
+        </w:rPr>
+        <w:t xml:space="preserve">Where possible, reference specific frameworks, real-world examples, or proven crisis communication approaches.</w:t>
+      </w:r>
+    </w:p>
+    <w:p>
+      <w:r>
+        <w:pict>
+          <v:rect style="width:0;height:1.5pt" o:hralign="center" o:hrstd="t" o:hr="t"/>
+        </w:pict>
+      </w:r>
+    </w:p>
+    <w:bookmarkEnd w:id="10"/>
+    <w:bookmarkStart w:id="11" w:name="model-response"/>
+    <w:p>
+      <w:pPr>
+        <w:pStyle w:val="Heading2"/>
+      </w:pPr>
+      <w:r>
         <w:t xml:space="preserve">Model Response</w:t>
       </w:r>
     </w:p>
-    <w:bookmarkEnd w:id="10"/>
     <w:bookmarkEnd w:id="11"/>
-    <w:bookmarkStart w:id="63" w:name="Xff67dd05b61bd3b04eacf98cf86a6827e859821"/>
+    <w:bookmarkEnd w:id="12"/>
+    <w:bookmarkStart w:id="64" w:name="Xff67dd05b61bd3b04eacf98cf86a6827e859821"/>
     <w:p>
       <w:pPr>
         <w:pStyle w:val="Heading1"/>
@@ -316,7 +509,7 @@
       <w:r>
         <w:t xml:space="preserve">Under UK law and guidance, the company should treat this as a serious food-safety event: cooperate fully with environmental health, preserve records, review food safety management/HACCP controls, and avoid any public speculation about cause until facts are confirmed. Local authorities and national partners such as the FSA and UKHSA have established outbreak-management roles in these situations. (</w:t>
       </w:r>
-      <w:hyperlink r:id="rId12">
+      <w:hyperlink r:id="rId13">
         <w:r>
           <w:rPr>
             <w:rStyle w:val="Hyperlink"/>
@@ -335,7 +528,7 @@
         </w:pict>
       </w:r>
     </w:p>
-    <w:bookmarkStart w:id="19" w:name="X49b8fbd596e311a8087588f752547d46db6abaf"/>
+    <w:bookmarkStart w:id="20" w:name="X49b8fbd596e311a8087588f752547d46db6abaf"/>
     <w:p>
       <w:pPr>
         <w:pStyle w:val="Heading2"/>
@@ -344,7 +537,7 @@
         <w:t xml:space="preserve">1. Immediate action plan for the next 24 hours</w:t>
       </w:r>
     </w:p>
-    <w:bookmarkStart w:id="13" w:name="first-60-minutes"/>
+    <w:bookmarkStart w:id="14" w:name="first-60-minutes"/>
     <w:p>
       <w:pPr>
         <w:pStyle w:val="Heading3"/>
@@ -531,8 +724,8 @@
         <w:t xml:space="preserve">This is the top priority if it has not already gone out. [H16] is explicit that silence gets read as evasion.</w:t>
       </w:r>
     </w:p>
-    <w:bookmarkEnd w:id="13"/>
-    <w:bookmarkStart w:id="15" w:name="hours-14"/>
+    <w:bookmarkEnd w:id="14"/>
+    <w:bookmarkStart w:id="16" w:name="hours-14"/>
     <w:p>
       <w:pPr>
         <w:pStyle w:val="Heading3"/>
@@ -660,7 +853,7 @@
       <w:r>
         <w:t xml:space="preserve">Your external position should be cooperative and non-defensive. Food businesses are expected to work with local authorities during suspected food poisoning incidents, and outbreak management in England is coordinated across local health protection, environmental health, FSA, and UKHSA structures. (</w:t>
       </w:r>
-      <w:hyperlink r:id="rId12">
+      <w:hyperlink r:id="rId13">
         <w:r>
           <w:rPr>
             <w:rStyle w:val="Hyperlink"/>
@@ -793,7 +986,7 @@
       <w:r>
         <w:t xml:space="preserve">The FSA expects businesses to have food safety management procedures based on HACCP principles. (</w:t>
       </w:r>
-      <w:hyperlink r:id="rId14">
+      <w:hyperlink r:id="rId15">
         <w:r>
           <w:rPr>
             <w:rStyle w:val="Hyperlink"/>
@@ -805,8 +998,8 @@
         <w:t xml:space="preserve">)</w:t>
       </w:r>
     </w:p>
-    <w:bookmarkEnd w:id="15"/>
-    <w:bookmarkStart w:id="16" w:name="hours-412"/>
+    <w:bookmarkEnd w:id="16"/>
+    <w:bookmarkStart w:id="17" w:name="hours-412"/>
     <w:p>
       <w:pPr>
         <w:pStyle w:val="Heading3"/>
@@ -955,8 +1148,8 @@
         <w:t xml:space="preserve">- later recorded interview only if facts improve</w:t>
       </w:r>
     </w:p>
-    <w:bookmarkEnd w:id="16"/>
-    <w:bookmarkStart w:id="18" w:name="hours-1224"/>
+    <w:bookmarkEnd w:id="17"/>
+    <w:bookmarkStart w:id="19" w:name="hours-1224"/>
     <w:p>
       <w:pPr>
         <w:pStyle w:val="Heading3"/>
@@ -1162,7 +1355,7 @@
       <w:r>
         <w:t xml:space="preserve">Follow a CERC-style rhythm: early messages should express empathy, explain what you know, what you do not yet know, and what actions people should take. (</w:t>
       </w:r>
-      <w:hyperlink r:id="rId17">
+      <w:hyperlink r:id="rId18">
         <w:r>
           <w:rPr>
             <w:rStyle w:val="Hyperlink"/>
@@ -1181,9 +1374,9 @@
         </w:pict>
       </w:r>
     </w:p>
-    <w:bookmarkEnd w:id="18"/>
     <w:bookmarkEnd w:id="19"/>
-    <w:bookmarkStart w:id="22" w:name="ready-to-use-holding-statement-for-media"/>
+    <w:bookmarkEnd w:id="20"/>
+    <w:bookmarkStart w:id="23" w:name="ready-to-use-holding-statement-for-media"/>
     <w:p>
       <w:pPr>
         <w:pStyle w:val="Heading2"/>
@@ -1270,7 +1463,7 @@
         <w:t xml:space="preserve">[CEO name], Chief Executive</w:t>
       </w:r>
     </w:p>
-    <w:bookmarkStart w:id="20" w:name="Xfbc78546fd9eb50d223addcb2c2dfa3a3813f4f"/>
+    <w:bookmarkStart w:id="21" w:name="Xfbc78546fd9eb50d223addcb2c2dfa3a3813f4f"/>
     <w:p>
       <w:pPr>
         <w:pStyle w:val="Heading3"/>
@@ -1287,8 +1480,8 @@
         <w:t xml:space="preserve">“Any customer who is concerned and believes they may have been affected should contact [dedicated phone/email/web page] so we can support them directly.”</w:t>
       </w:r>
     </w:p>
-    <w:bookmarkEnd w:id="20"/>
-    <w:bookmarkStart w:id="21" w:name="what-the-ceo-should-say-if-pressed-live"/>
+    <w:bookmarkEnd w:id="21"/>
+    <w:bookmarkStart w:id="22" w:name="what-the-ceo-should-say-if-pressed-live"/>
     <w:p>
       <w:pPr>
         <w:pStyle w:val="Heading3"/>
@@ -1330,9 +1523,9 @@
         </w:pict>
       </w:r>
     </w:p>
-    <w:bookmarkEnd w:id="21"/>
     <w:bookmarkEnd w:id="22"/>
-    <w:bookmarkStart w:id="35" w:name="social-media-response-strategy"/>
+    <w:bookmarkEnd w:id="23"/>
+    <w:bookmarkStart w:id="36" w:name="social-media-response-strategy"/>
     <w:p>
       <w:pPr>
         <w:pStyle w:val="Heading2"/>
@@ -1365,7 +1558,7 @@
         <w:t xml:space="preserve">[H17].</w:t>
       </w:r>
     </w:p>
-    <w:bookmarkStart w:id="23" w:name="channel-strategy-for-the-next-7-days"/>
+    <w:bookmarkStart w:id="24" w:name="channel-strategy-for-the-next-7-days"/>
     <w:p>
       <w:pPr>
         <w:pStyle w:val="Heading3"/>
@@ -1488,8 +1681,8 @@
         <w:t xml:space="preserve">6. legal-risk comments naming individuals or alleging facts not in evidence</w:t>
       </w:r>
     </w:p>
-    <w:bookmarkEnd w:id="23"/>
-    <w:bookmarkStart w:id="24" w:name="tone"/>
+    <w:bookmarkEnd w:id="24"/>
+    <w:bookmarkStart w:id="25" w:name="tone"/>
     <w:p>
       <w:pPr>
         <w:pStyle w:val="Heading3"/>
@@ -1524,7 +1717,7 @@
       <w:r>
         <w:t xml:space="preserve">This is also consistent with CERC: express empathy, be first, be credible, promote action, show respect. (</w:t>
       </w:r>
-      <w:hyperlink r:id="rId17">
+      <w:hyperlink r:id="rId18">
         <w:r>
           <w:rPr>
             <w:rStyle w:val="Hyperlink"/>
@@ -1536,8 +1729,8 @@
         <w:t xml:space="preserve">)</w:t>
       </w:r>
     </w:p>
-    <w:bookmarkEnd w:id="24"/>
-    <w:bookmarkStart w:id="34" w:name="template-responses"/>
+    <w:bookmarkEnd w:id="25"/>
+    <w:bookmarkStart w:id="35" w:name="template-responses"/>
     <w:p>
       <w:pPr>
         <w:pStyle w:val="Heading3"/>
@@ -1546,7 +1739,7 @@
         <w:t xml:space="preserve">Template responses</w:t>
       </w:r>
     </w:p>
-    <w:bookmarkStart w:id="25" w:name="a.-angry-customer"/>
+    <w:bookmarkStart w:id="26" w:name="a.-angry-customer"/>
     <w:p>
       <w:pPr>
         <w:pStyle w:val="Heading4"/>
@@ -1563,8 +1756,8 @@
         <w:t xml:space="preserve">We’re very sorry to read this. We’re treating this with the utmost seriousness and are cooperating fully with the environmental health investigation. Please send your contact details to [email/DM route] so our team can support you directly.</w:t>
       </w:r>
     </w:p>
-    <w:bookmarkEnd w:id="25"/>
-    <w:bookmarkStart w:id="26" w:name="b.-your-food-made-people-seriously-ill"/>
+    <w:bookmarkEnd w:id="26"/>
+    <w:bookmarkStart w:id="27" w:name="b.-your-food-made-people-seriously-ill"/>
     <w:p>
       <w:pPr>
         <w:pStyle w:val="Heading4"/>
@@ -1581,8 +1774,8 @@
         <w:t xml:space="preserve">We understand why people are deeply concerned. Our Manchester restaurant is closed as a precaution while the investigation is underway, and we’re cooperating fully with the relevant authorities. We’ll share further verified updates as soon as we can.</w:t>
       </w:r>
     </w:p>
-    <w:bookmarkEnd w:id="26"/>
-    <w:bookmarkStart w:id="27" w:name="Xb9d04cdfd291ca2913348398db916ad8e291610"/>
+    <w:bookmarkEnd w:id="27"/>
+    <w:bookmarkStart w:id="28" w:name="Xb9d04cdfd291ca2913348398db916ad8e291610"/>
     <w:p>
       <w:pPr>
         <w:pStyle w:val="Heading4"/>
@@ -1599,8 +1792,8 @@
         <w:t xml:space="preserve">We understand the concern. It would be inappropriate to speculate while the investigation is active, but we are taking immediate action, including precautionary checks and full cooperation with environmental health.</w:t>
       </w:r>
     </w:p>
-    <w:bookmarkEnd w:id="27"/>
-    <w:bookmarkStart w:id="28" w:name="X9a22d3b374a13601efbe08955b566858479e7ab"/>
+    <w:bookmarkEnd w:id="28"/>
+    <w:bookmarkStart w:id="29" w:name="X9a22d3b374a13601efbe08955b566858479e7ab"/>
     <w:p>
       <w:pPr>
         <w:pStyle w:val="Heading4"/>
@@ -1617,8 +1810,8 @@
         <w:t xml:space="preserve">We understand why customers are asking this. We have initiated immediate checks across our wider estate as a precaution. At present, the investigation relates to our Manchester restaurant, and we will provide updates if that position changes.</w:t>
       </w:r>
     </w:p>
-    <w:bookmarkEnd w:id="28"/>
-    <w:bookmarkStart w:id="29" w:name="e.-request-for-refund-compensation"/>
+    <w:bookmarkEnd w:id="29"/>
+    <w:bookmarkStart w:id="30" w:name="e.-request-for-refund-compensation"/>
     <w:p>
       <w:pPr>
         <w:pStyle w:val="Heading4"/>
@@ -1635,8 +1828,8 @@
         <w:t xml:space="preserve">Please contact [dedicated email/phone/form] with your visit details so our customer support team can review this urgently.</w:t>
       </w:r>
     </w:p>
-    <w:bookmarkEnd w:id="29"/>
-    <w:bookmarkStart w:id="30" w:name="f.-journalist-on-social-media"/>
+    <w:bookmarkEnd w:id="30"/>
+    <w:bookmarkStart w:id="31" w:name="f.-journalist-on-social-media"/>
     <w:p>
       <w:pPr>
         <w:pStyle w:val="Heading4"/>
@@ -1653,8 +1846,8 @@
         <w:t xml:space="preserve">Thanks for your message. Please send media enquiries to [press email/mobile]. Our current statement is here: [link].</w:t>
       </w:r>
     </w:p>
-    <w:bookmarkEnd w:id="30"/>
-    <w:bookmarkStart w:id="31" w:name="g.-misinformation-false-viral-claim"/>
+    <w:bookmarkEnd w:id="31"/>
+    <w:bookmarkStart w:id="32" w:name="g.-misinformation-false-viral-claim"/>
     <w:p>
       <w:pPr>
         <w:pStyle w:val="Heading4"/>
@@ -1671,8 +1864,8 @@
         <w:t xml:space="preserve">We want to correct one point: [brief factual correction]. We are cooperating fully with the ongoing investigation and will continue to share verified updates through our official channels.</w:t>
       </w:r>
     </w:p>
-    <w:bookmarkEnd w:id="31"/>
-    <w:bookmarkStart w:id="32" w:name="h.-abusive-profane-comment"/>
+    <w:bookmarkEnd w:id="32"/>
+    <w:bookmarkStart w:id="33" w:name="h.-abusive-profane-comment"/>
     <w:p>
       <w:pPr>
         <w:pStyle w:val="Heading4"/>
@@ -1689,8 +1882,8 @@
         <w:t xml:space="preserve">No public back-and-forth. Hide or moderate only if it breaches platform rules or includes threats/doxxing [H17].</w:t>
       </w:r>
     </w:p>
-    <w:bookmarkEnd w:id="32"/>
-    <w:bookmarkStart w:id="33" w:name="i.-staff-posting-publicly"/>
+    <w:bookmarkEnd w:id="33"/>
+    <w:bookmarkStart w:id="34" w:name="i.-staff-posting-publicly"/>
     <w:p>
       <w:pPr>
         <w:pStyle w:val="Heading4"/>
@@ -1714,10 +1907,10 @@
         </w:pict>
       </w:r>
     </w:p>
-    <w:bookmarkEnd w:id="33"/>
     <w:bookmarkEnd w:id="34"/>
     <w:bookmarkEnd w:id="35"/>
-    <w:bookmarkStart w:id="40" w:name="Xb26462b5ceb401ae992cf37f4ac9561ffb9ede4"/>
+    <w:bookmarkEnd w:id="36"/>
+    <w:bookmarkStart w:id="41" w:name="Xb26462b5ceb401ae992cf37f4ac9561ffb9ede4"/>
     <w:p>
       <w:pPr>
         <w:pStyle w:val="Heading2"/>
@@ -1726,7 +1919,7 @@
         <w:t xml:space="preserve">4. Plan for the next 30 days to stabilise the situation</w:t>
       </w:r>
     </w:p>
-    <w:bookmarkStart w:id="36" w:name="days-13"/>
+    <w:bookmarkStart w:id="37" w:name="days-13"/>
     <w:p>
       <w:pPr>
         <w:pStyle w:val="Heading3"/>
@@ -1819,8 +2012,8 @@
         <w:t xml:space="preserve">Identify whether a short video statement will help or inflame</w:t>
       </w:r>
     </w:p>
-    <w:bookmarkEnd w:id="36"/>
-    <w:bookmarkStart w:id="37" w:name="days-47"/>
+    <w:bookmarkEnd w:id="37"/>
+    <w:bookmarkStart w:id="38" w:name="days-47"/>
     <w:p>
       <w:pPr>
         <w:pStyle w:val="Heading3"/>
@@ -1925,8 +2118,8 @@
         <w:t xml:space="preserve">Decide whether branches need local signage/customer notices</w:t>
       </w:r>
     </w:p>
-    <w:bookmarkEnd w:id="37"/>
-    <w:bookmarkStart w:id="38" w:name="days-814"/>
+    <w:bookmarkEnd w:id="38"/>
+    <w:bookmarkStart w:id="39" w:name="days-814"/>
     <w:p>
       <w:pPr>
         <w:pStyle w:val="Heading3"/>
@@ -1995,8 +2188,8 @@
         <w:t xml:space="preserve">If regulators permit, begin selective proactive media outreach with evidence of action</w:t>
       </w:r>
     </w:p>
-    <w:bookmarkEnd w:id="38"/>
-    <w:bookmarkStart w:id="39" w:name="days-1530"/>
+    <w:bookmarkEnd w:id="39"/>
+    <w:bookmarkStart w:id="40" w:name="days-1530"/>
     <w:p>
       <w:pPr>
         <w:pStyle w:val="Heading3"/>
@@ -2116,9 +2309,9 @@
         </w:pict>
       </w:r>
     </w:p>
-    <w:bookmarkEnd w:id="39"/>
     <w:bookmarkEnd w:id="40"/>
-    <w:bookmarkStart w:id="45" w:name="month-reputation-recovery-strategy"/>
+    <w:bookmarkEnd w:id="41"/>
+    <w:bookmarkStart w:id="46" w:name="month-reputation-recovery-strategy"/>
     <w:p>
       <w:pPr>
         <w:pStyle w:val="Heading2"/>
@@ -2148,7 +2341,7 @@
         <w:t xml:space="preserve">, not a two-week PR burst [CS11]. Use four workstreams:</w:t>
       </w:r>
     </w:p>
-    <w:bookmarkStart w:id="41" w:name="a.-safety-and-governance-rebuild"/>
+    <w:bookmarkStart w:id="42" w:name="a.-safety-and-governance-rebuild"/>
     <w:p>
       <w:pPr>
         <w:pStyle w:val="Heading3"/>
@@ -2236,7 +2429,7 @@
       <w:r>
         <w:t xml:space="preserve">The FSA’s business guidance reinforces the need for robust food safety management systems. (</w:t>
       </w:r>
-      <w:hyperlink r:id="rId14">
+      <w:hyperlink r:id="rId15">
         <w:r>
           <w:rPr>
             <w:rStyle w:val="Hyperlink"/>
@@ -2248,8 +2441,8 @@
         <w:t xml:space="preserve">)</w:t>
       </w:r>
     </w:p>
-    <w:bookmarkEnd w:id="41"/>
-    <w:bookmarkStart w:id="42" w:name="b.-communications-and-transparency"/>
+    <w:bookmarkEnd w:id="42"/>
+    <w:bookmarkStart w:id="43" w:name="b.-communications-and-transparency"/>
     <w:p>
       <w:pPr>
         <w:pStyle w:val="Heading3"/>
@@ -2318,8 +2511,8 @@
         <w:t xml:space="preserve">case-study style content showing operational improvements</w:t>
       </w:r>
     </w:p>
-    <w:bookmarkEnd w:id="42"/>
-    <w:bookmarkStart w:id="43" w:name="c.-social-and-content-recovery"/>
+    <w:bookmarkEnd w:id="43"/>
+    <w:bookmarkStart w:id="44" w:name="c.-social-and-content-recovery"/>
     <w:p>
       <w:pPr>
         <w:pStyle w:val="Heading3"/>
@@ -2390,8 +2583,8 @@
         <w:t xml:space="preserve">[H17]. In [CS11], that sustained approach supported the 12‑month recovery with major channel growth [CS11].</w:t>
       </w:r>
     </w:p>
-    <w:bookmarkEnd w:id="43"/>
-    <w:bookmarkStart w:id="44" w:name="X7b8883df373993a0c1383be55a9afb380b6fc7c"/>
+    <w:bookmarkEnd w:id="44"/>
+    <w:bookmarkStart w:id="45" w:name="X7b8883df373993a0c1383be55a9afb380b6fc7c"/>
     <w:p>
       <w:pPr>
         <w:pStyle w:val="Heading3"/>
@@ -2501,9 +2694,9 @@
         </w:pict>
       </w:r>
     </w:p>
-    <w:bookmarkEnd w:id="44"/>
     <w:bookmarkEnd w:id="45"/>
-    <w:bookmarkStart w:id="52" w:name="X54580da4a62cd4a16733deea4bcda866c27e3fd"/>
+    <w:bookmarkEnd w:id="46"/>
+    <w:bookmarkStart w:id="53" w:name="X54580da4a62cd4a16733deea4bcda866c27e3fd"/>
     <w:p>
       <w:pPr>
         <w:pStyle w:val="Heading2"/>
@@ -2549,7 +2742,7 @@
         <w:t xml:space="preserve">.</w:t>
       </w:r>
     </w:p>
-    <w:bookmarkStart w:id="48" w:name="what-to-do-immediately"/>
+    <w:bookmarkStart w:id="49" w:name="what-to-do-immediately"/>
     <w:p>
       <w:pPr>
         <w:pStyle w:val="Heading3"/>
@@ -2641,7 +2834,7 @@
       <w:r>
         <w:t xml:space="preserve">Trustpilot allows businesses to flag reviews that breach guidelines, including fake reviews, harmful content, and personal information, but misuse of flagging tools is itself a risk. (</w:t>
       </w:r>
-      <w:hyperlink r:id="rId46">
+      <w:hyperlink r:id="rId47">
         <w:r>
           <w:rPr>
             <w:rStyle w:val="Hyperlink"/>
@@ -2701,7 +2894,7 @@
         <w:t xml:space="preserve">- move to an offline channel</w:t>
       </w:r>
     </w:p>
-    <w:bookmarkStart w:id="47" w:name="example-trustpilot-response"/>
+    <w:bookmarkStart w:id="48" w:name="example-trustpilot-response"/>
     <w:p>
       <w:pPr>
         <w:pStyle w:val="Heading4"/>
@@ -2718,9 +2911,9 @@
         <w:t xml:space="preserve">We are very sorry for the concern this incident has caused. We are cooperating fully with the ongoing environmental health investigation and have taken immediate precautionary action. If you visited the restaurant and would like support, please contact [team/email] with your booking details so we can assist directly.</w:t>
       </w:r>
     </w:p>
-    <w:bookmarkEnd w:id="47"/>
     <w:bookmarkEnd w:id="48"/>
-    <w:bookmarkStart w:id="50" w:name="what-not-to-do"/>
+    <w:bookmarkEnd w:id="49"/>
+    <w:bookmarkStart w:id="51" w:name="what-not-to-do"/>
     <w:p>
       <w:pPr>
         <w:pStyle w:val="Heading3"/>
@@ -2772,7 +2965,7 @@
       <w:r>
         <w:t xml:space="preserve">The CMA’s 2025 fake reviews guidance says businesses that publish consumer reviews must take steps to prevent fake reviews and misleading review information. (</w:t>
       </w:r>
-      <w:hyperlink r:id="rId49">
+      <w:hyperlink r:id="rId50">
         <w:r>
           <w:rPr>
             <w:rStyle w:val="Hyperlink"/>
@@ -2784,8 +2977,8 @@
         <w:t xml:space="preserve">)</w:t>
       </w:r>
     </w:p>
-    <w:bookmarkEnd w:id="50"/>
-    <w:bookmarkStart w:id="51" w:name="recovery-objective"/>
+    <w:bookmarkEnd w:id="51"/>
+    <w:bookmarkStart w:id="52" w:name="recovery-objective"/>
     <w:p>
       <w:pPr>
         <w:pStyle w:val="Heading3"/>
@@ -2841,9 +3034,9 @@
         </w:pict>
       </w:r>
     </w:p>
-    <w:bookmarkEnd w:id="51"/>
     <w:bookmarkEnd w:id="52"/>
-    <w:bookmarkStart w:id="56" w:name="X28027ec8d9b705266e1b9e3ceb85c82bc5bade2"/>
+    <w:bookmarkEnd w:id="53"/>
+    <w:bookmarkStart w:id="57" w:name="X28027ec8d9b705266e1b9e3ceb85c82bc5bade2"/>
     <w:p>
       <w:pPr>
         <w:pStyle w:val="Heading2"/>
@@ -2873,7 +3066,7 @@
         <w:t xml:space="preserve">, not quotes.</w:t>
       </w:r>
     </w:p>
-    <w:bookmarkStart w:id="53" w:name="first-30-days-crisis-containment"/>
+    <w:bookmarkStart w:id="54" w:name="first-30-days-crisis-containment"/>
     <w:p>
       <w:pPr>
         <w:pStyle w:val="Heading3"/>
@@ -3014,8 +3207,8 @@
         <w:t xml:space="preserve">£55,000–£185,000+</w:t>
       </w:r>
     </w:p>
-    <w:bookmarkEnd w:id="53"/>
-    <w:bookmarkStart w:id="54" w:name="month-recovery"/>
+    <w:bookmarkEnd w:id="54"/>
+    <w:bookmarkStart w:id="55" w:name="month-recovery"/>
     <w:p>
       <w:pPr>
         <w:pStyle w:val="Heading3"/>
@@ -3156,8 +3349,8 @@
         <w:t xml:space="preserve">£75,000–£300,000+</w:t>
       </w:r>
     </w:p>
-    <w:bookmarkEnd w:id="54"/>
-    <w:bookmarkStart w:id="55" w:name="planning-assumption"/>
+    <w:bookmarkEnd w:id="55"/>
+    <w:bookmarkStart w:id="56" w:name="planning-assumption"/>
     <w:p>
       <w:pPr>
         <w:pStyle w:val="Heading3"/>
@@ -3197,9 +3390,9 @@
         </w:pict>
       </w:r>
     </w:p>
-    <w:bookmarkEnd w:id="55"/>
     <w:bookmarkEnd w:id="56"/>
-    <w:bookmarkStart w:id="60" w:name="prioritised-action-checklist-for-today"/>
+    <w:bookmarkEnd w:id="57"/>
+    <w:bookmarkStart w:id="61" w:name="prioritised-action-checklist-for-today"/>
     <w:p>
       <w:pPr>
         <w:pStyle w:val="Heading2"/>
@@ -3208,7 +3401,7 @@
         <w:t xml:space="preserve">8. Prioritised action checklist for today</w:t>
       </w:r>
     </w:p>
-    <w:bookmarkStart w:id="57" w:name="priority-1-do-in-the-next-2-hours"/>
+    <w:bookmarkStart w:id="58" w:name="priority-1-do-in-the-next-2-hours"/>
     <w:p>
       <w:pPr>
         <w:pStyle w:val="Heading3"/>
@@ -3325,8 +3518,8 @@
         <w:t xml:space="preserve">Prepare press inbox and response protocol</w:t>
       </w:r>
     </w:p>
-    <w:bookmarkEnd w:id="57"/>
-    <w:bookmarkStart w:id="58" w:name="priority-2-do-today"/>
+    <w:bookmarkEnd w:id="58"/>
+    <w:bookmarkStart w:id="59" w:name="priority-2-do-today"/>
     <w:p>
       <w:pPr>
         <w:pStyle w:val="Heading3"/>
@@ -3431,8 +3624,8 @@
         <w:t xml:space="preserve">Start Trustpilot review triage and response workflow</w:t>
       </w:r>
     </w:p>
-    <w:bookmarkEnd w:id="58"/>
-    <w:bookmarkStart w:id="59" w:name="priority-3-by-end-of-day"/>
+    <w:bookmarkEnd w:id="59"/>
+    <w:bookmarkStart w:id="60" w:name="priority-3-by-end-of-day"/>
     <w:p>
       <w:pPr>
         <w:pStyle w:val="Heading3"/>
@@ -3520,9 +3713,9 @@
         </w:pict>
       </w:r>
     </w:p>
-    <w:bookmarkEnd w:id="59"/>
     <w:bookmarkEnd w:id="60"/>
-    <w:bookmarkStart w:id="61" w:name="recommended-operating-framework"/>
+    <w:bookmarkEnd w:id="61"/>
+    <w:bookmarkStart w:id="62" w:name="recommended-operating-framework"/>
     <w:p>
       <w:pPr>
         <w:pStyle w:val="Heading2"/>
@@ -3660,7 +3853,7 @@
       <w:r>
         <w:t xml:space="preserve">. CERC supports the same logic: be early, credible, empathetic, action-oriented, and respectful. (</w:t>
       </w:r>
-      <w:hyperlink r:id="rId17">
+      <w:hyperlink r:id="rId18">
         <w:r>
           <w:rPr>
             <w:rStyle w:val="Hyperlink"/>
@@ -3679,8 +3872,8 @@
         </w:pict>
       </w:r>
     </w:p>
-    <w:bookmarkEnd w:id="61"/>
-    <w:bookmarkStart w:id="62" w:name="bottom-line-for-the-ceo"/>
+    <w:bookmarkEnd w:id="62"/>
+    <w:bookmarkStart w:id="63" w:name="bottom-line-for-the-ceo"/>
     <w:p>
       <w:pPr>
         <w:pStyle w:val="Heading2"/>
@@ -3736,8 +3929,8 @@
         </w:pict>
       </w:r>
     </w:p>
-    <w:bookmarkEnd w:id="62"/>
     <w:bookmarkEnd w:id="63"/>
+    <w:bookmarkEnd w:id="64"/>
     <w:sectPr>
       <w:footnotePr>
         <w:numRestart w:val="eachSect"/>

</xml_diff>